<commit_message>
Render full strength training plan details directly below schedule table in Subtab 2
</commit_message>
<xml_diff>
--- a/docs/weekly/2026-W31_第31週肌力訓練計畫.docx
+++ b/docs/weekly/2026-W31_第31週肌力訓練計畫.docx
@@ -2924,7 +2924,7 @@
           <w:color w:val="385623"/>
           <w:sz w:val="22"/>
         </w:rPr>
-        <w:t xml:space="preserve">  - 樂觀目標 (高峰發揮 / 全場未抽筋)：11:35 – 11:50 (預估中位數 11:42)</w:t>
+        <w:t xml:space="preserve">  - 樂觀目標 (高峰發揮 / 全場未抽筋)：11:19 – 11:34 (預估中位數 11:26)</w:t>
         <w:br/>
       </w:r>
       <w:r>
@@ -2934,7 +2934,7 @@
           <w:color w:val="C55A11"/>
           <w:sz w:val="22"/>
         </w:rPr>
-        <w:t xml:space="preserve">  - 中性目標 (穩定完賽 / 體力適當分配)：11:24 – 11:48 (預估中位數 11:36)</w:t>
+        <w:t xml:space="preserve">  - 中性目標 (穩定完賽 / 體力適當分配)：11:31 – 11:55 (預估中位數 11:43)</w:t>
         <w:br/>
       </w:r>
       <w:r>
@@ -2944,7 +2944,7 @@
           <w:color w:val="C00000"/>
           <w:sz w:val="22"/>
         </w:rPr>
-        <w:t xml:space="preserve">  - 保守目標 (後半程馬拉松掉速/抽筋)：11:42 – 12:17 (預估中位數 11:57)</w:t>
+        <w:t xml:space="preserve">  - 保守目標 (後半程馬拉松掉速/抽筋)：11:46 – 12:21 (預估中位數 12:01)</w:t>
         <w:br/>
       </w:r>
     </w:p>

</xml_diff>